<commit_message>
contracts working: contract act invoice for person/company/ip
</commit_message>
<xml_diff>
--- a/templates/contract_person_template.docx
+++ b/templates/contract_person_template.docx
@@ -744,24 +744,6 @@
           <w:sz w:val="20"/>
           <w:szCs w:val="20"/>
         </w:rPr>
-        <w:t xml:space="preserve"> именуем</w:t>
-      </w:r>
-      <w:r>
-        <w:rPr>
-          <w:rFonts w:ascii="Times New Roman" w:hAnsi="Times New Roman"/>
-          <w:spacing w:val="20"/>
-          <w:sz w:val="20"/>
-          <w:szCs w:val="20"/>
-        </w:rPr>
-        <w:t>ый</w:t>
-      </w:r>
-      <w:r>
-        <w:rPr>
-          <w:rFonts w:ascii="Times New Roman" w:hAnsi="Times New Roman"/>
-          <w:spacing w:val="20"/>
-          <w:sz w:val="20"/>
-          <w:szCs w:val="20"/>
-        </w:rPr>
         <w:t xml:space="preserve"> </w:t>
       </w:r>
       <w:r>
@@ -771,6 +753,24 @@
           <w:sz w:val="20"/>
           <w:szCs w:val="20"/>
         </w:rPr>
+        <w:t>именуемая</w:t>
+      </w:r>
+      <w:r>
+        <w:rPr>
+          <w:rFonts w:ascii="Times New Roman" w:hAnsi="Times New Roman"/>
+          <w:spacing w:val="20"/>
+          <w:sz w:val="20"/>
+          <w:szCs w:val="20"/>
+        </w:rPr>
+        <w:t xml:space="preserve"> </w:t>
+      </w:r>
+      <w:r>
+        <w:rPr>
+          <w:rFonts w:ascii="Times New Roman" w:hAnsi="Times New Roman"/>
+          <w:spacing w:val="20"/>
+          <w:sz w:val="20"/>
+          <w:szCs w:val="20"/>
+        </w:rPr>
         <w:t>в дальнейшем «</w:t>
       </w:r>
       <w:r>
@@ -816,16 +816,16 @@
           <w:sz w:val="20"/>
           <w:szCs w:val="20"/>
         </w:rPr>
-        <w:t>, именуем</w:t>
-      </w:r>
-      <w:r>
-        <w:rPr>
-          <w:rFonts w:ascii="Times New Roman" w:hAnsi="Times New Roman"/>
-          <w:spacing w:val="20"/>
-          <w:sz w:val="20"/>
-          <w:szCs w:val="20"/>
-        </w:rPr>
-        <w:t>ый</w:t>
+        <w:t xml:space="preserve">, </w:t>
+      </w:r>
+      <w:r>
+        <w:rPr>
+          <w:rFonts w:ascii="Times New Roman" w:hAnsi="Times New Roman"/>
+          <w:spacing w:val="20"/>
+          <w:sz w:val="20"/>
+          <w:szCs w:val="20"/>
+        </w:rPr>
+        <w:t>{TENANT_NAMED_AS}</w:t>
       </w:r>
       <w:r>
         <w:rPr>
@@ -2772,7 +2772,27 @@
           <w:sz w:val="20"/>
           <w:szCs w:val="20"/>
         </w:rPr>
-        <w:t xml:space="preserve"> шуметь, кричать, проводить шумные мероприятия, оказывать услуги различного характера, размещать третьих лиц не заявленных при бронировании, ходить в обуви.</w:t>
+        <w:t xml:space="preserve"> шуметь, кричать, проводить шумные мероприятия, оказывать услуги различного характера, размещать </w:t>
+      </w:r>
+      <w:proofErr w:type="gramStart"/>
+      <w:r>
+        <w:rPr>
+          <w:rFonts w:ascii="Times New Roman" w:hAnsi="Times New Roman"/>
+          <w:spacing w:val="20"/>
+          <w:sz w:val="20"/>
+          <w:szCs w:val="20"/>
+        </w:rPr>
+        <w:t>третьих лиц</w:t>
+      </w:r>
+      <w:proofErr w:type="gramEnd"/>
+      <w:r>
+        <w:rPr>
+          <w:rFonts w:ascii="Times New Roman" w:hAnsi="Times New Roman"/>
+          <w:spacing w:val="20"/>
+          <w:sz w:val="20"/>
+          <w:szCs w:val="20"/>
+        </w:rPr>
+        <w:t xml:space="preserve"> не заявленных при бронировании, ходить в обуви.</w:t>
       </w:r>
       <w:r>
         <w:rPr>
@@ -2816,8 +2836,9 @@
           <w:sz w:val="20"/>
           <w:szCs w:val="20"/>
         </w:rPr>
-        <w:t>.2.2. Выселить Арендатора при нарушении правил проживания согласно п</w:t>
-      </w:r>
+        <w:t xml:space="preserve">.2.2. Выселить Арендатора при нарушении правил проживания согласно </w:t>
+      </w:r>
+      <w:proofErr w:type="spellStart"/>
       <w:r>
         <w:rPr>
           <w:rFonts w:ascii="Times New Roman" w:hAnsi="Times New Roman"/>
@@ -2834,6 +2855,16 @@
           <w:sz w:val="20"/>
           <w:szCs w:val="20"/>
         </w:rPr>
+        <w:t>п</w:t>
+      </w:r>
+      <w:proofErr w:type="spellEnd"/>
+      <w:r>
+        <w:rPr>
+          <w:rFonts w:ascii="Times New Roman" w:hAnsi="Times New Roman"/>
+          <w:spacing w:val="20"/>
+          <w:sz w:val="20"/>
+          <w:szCs w:val="20"/>
+        </w:rPr>
         <w:t xml:space="preserve">. </w:t>
       </w:r>
       <w:r>
@@ -2852,7 +2883,27 @@
           <w:sz w:val="20"/>
           <w:szCs w:val="20"/>
         </w:rPr>
-        <w:t>.2.1., а так же при нанесении Арендатор</w:t>
+        <w:t xml:space="preserve">.2.1., а </w:t>
+      </w:r>
+      <w:proofErr w:type="gramStart"/>
+      <w:r>
+        <w:rPr>
+          <w:rFonts w:ascii="Times New Roman" w:hAnsi="Times New Roman"/>
+          <w:spacing w:val="20"/>
+          <w:sz w:val="20"/>
+          <w:szCs w:val="20"/>
+        </w:rPr>
+        <w:t>так же</w:t>
+      </w:r>
+      <w:proofErr w:type="gramEnd"/>
+      <w:r>
+        <w:rPr>
+          <w:rFonts w:ascii="Times New Roman" w:hAnsi="Times New Roman"/>
+          <w:spacing w:val="20"/>
+          <w:sz w:val="20"/>
+          <w:szCs w:val="20"/>
+        </w:rPr>
+        <w:t xml:space="preserve"> при нанесении Арендатор</w:t>
       </w:r>
       <w:r>
         <w:rPr>
@@ -2934,7 +2985,27 @@
           <w:sz w:val="20"/>
           <w:szCs w:val="20"/>
         </w:rPr>
-        <w:t xml:space="preserve"> возмещение ущерба нанесенного </w:t>
+        <w:t xml:space="preserve"> возмещение </w:t>
+      </w:r>
+      <w:proofErr w:type="gramStart"/>
+      <w:r>
+        <w:rPr>
+          <w:rFonts w:ascii="Times New Roman" w:hAnsi="Times New Roman"/>
+          <w:spacing w:val="20"/>
+          <w:sz w:val="20"/>
+          <w:szCs w:val="20"/>
+        </w:rPr>
+        <w:t>ущерба</w:t>
+      </w:r>
+      <w:proofErr w:type="gramEnd"/>
+      <w:r>
+        <w:rPr>
+          <w:rFonts w:ascii="Times New Roman" w:hAnsi="Times New Roman"/>
+          <w:spacing w:val="20"/>
+          <w:sz w:val="20"/>
+          <w:szCs w:val="20"/>
+        </w:rPr>
+        <w:t xml:space="preserve"> нанесенного </w:t>
       </w:r>
       <w:r>
         <w:rPr>
@@ -3361,7 +3432,27 @@
           <w:sz w:val="20"/>
           <w:szCs w:val="20"/>
         </w:rPr>
-        <w:t>. Возместить ущерб нанесенный Арендатор</w:t>
+        <w:t xml:space="preserve">. Возместить </w:t>
+      </w:r>
+      <w:proofErr w:type="gramStart"/>
+      <w:r>
+        <w:rPr>
+          <w:rFonts w:ascii="Times New Roman" w:hAnsi="Times New Roman"/>
+          <w:spacing w:val="20"/>
+          <w:sz w:val="20"/>
+          <w:szCs w:val="20"/>
+        </w:rPr>
+        <w:t>ущерб</w:t>
+      </w:r>
+      <w:proofErr w:type="gramEnd"/>
+      <w:r>
+        <w:rPr>
+          <w:rFonts w:ascii="Times New Roman" w:hAnsi="Times New Roman"/>
+          <w:spacing w:val="20"/>
+          <w:sz w:val="20"/>
+          <w:szCs w:val="20"/>
+        </w:rPr>
+        <w:t xml:space="preserve"> нанесенный Арендатор</w:t>
       </w:r>
       <w:r>
         <w:rPr>
@@ -3379,7 +3470,27 @@
           <w:sz w:val="20"/>
           <w:szCs w:val="20"/>
         </w:rPr>
-        <w:t>, а так же упущенную выгоду</w:t>
+        <w:t xml:space="preserve">, а </w:t>
+      </w:r>
+      <w:proofErr w:type="gramStart"/>
+      <w:r>
+        <w:rPr>
+          <w:rFonts w:ascii="Times New Roman" w:hAnsi="Times New Roman"/>
+          <w:spacing w:val="20"/>
+          <w:sz w:val="20"/>
+          <w:szCs w:val="20"/>
+        </w:rPr>
+        <w:t>так же</w:t>
+      </w:r>
+      <w:proofErr w:type="gramEnd"/>
+      <w:r>
+        <w:rPr>
+          <w:rFonts w:ascii="Times New Roman" w:hAnsi="Times New Roman"/>
+          <w:spacing w:val="20"/>
+          <w:sz w:val="20"/>
+          <w:szCs w:val="20"/>
+        </w:rPr>
+        <w:t xml:space="preserve"> упущенную выгоду</w:t>
       </w:r>
       <w:r>
         <w:rPr>
@@ -4027,7 +4138,27 @@
           <w:sz w:val="20"/>
           <w:szCs w:val="20"/>
         </w:rPr>
-        <w:t xml:space="preserve"> существенного ущерба квартире или имуществу, при наличии жалоб на действия Арендатора со стороны соседей, а также при нарушении правил проживания, согласно пп. </w:t>
+        <w:t xml:space="preserve"> существенного ущерба квартире или имуществу, при наличии жалоб на действия Арендатора со стороны соседей, а также при нарушении правил проживания, согласно </w:t>
+      </w:r>
+      <w:proofErr w:type="spellStart"/>
+      <w:r>
+        <w:rPr>
+          <w:rFonts w:ascii="Times New Roman" w:hAnsi="Times New Roman"/>
+          <w:spacing w:val="20"/>
+          <w:sz w:val="20"/>
+          <w:szCs w:val="20"/>
+        </w:rPr>
+        <w:t>пп</w:t>
+      </w:r>
+      <w:proofErr w:type="spellEnd"/>
+      <w:r>
+        <w:rPr>
+          <w:rFonts w:ascii="Times New Roman" w:hAnsi="Times New Roman"/>
+          <w:spacing w:val="20"/>
+          <w:sz w:val="20"/>
+          <w:szCs w:val="20"/>
+        </w:rPr>
+        <w:t xml:space="preserve">. </w:t>
       </w:r>
       <w:r>
         <w:rPr>

</xml_diff>